<commit_message>
docs: corregir ilustracion de senal vial integrando cluster LED dentro de la lamina retroreflectiva segun placa real
</commit_message>
<xml_diff>
--- a/Manuales/MANUAL_USUARIO_APP.docx
+++ b/Manuales/MANUAL_USUARIO_APP.docx
@@ -159,7 +159,7 @@
       <w:r>
         <w:drawing>
           <wp:inline>
-            <wp:extent cx="5334000" cy="7467599"/>
+            <wp:extent cx="5334000" cy="8178799"/>
             <wp:effectExtent b="0" l="0" r="0" t="0"/>
             <wp:docPr descr="Señal Vial de Referencia" title="" id="14" name="Picture"/>
             <a:graphic>
@@ -180,7 +180,7 @@
                   <pic:spPr bwMode="auto">
                     <a:xfrm>
                       <a:off x="0" y="0"/>
-                      <a:ext cx="5334000" cy="7467599"/>
+                      <a:ext cx="5334000" cy="8178799"/>
                     </a:xfrm>
                     <a:prstGeom prst="rect">
                       <a:avLst/>

</xml_diff>

<commit_message>
docs(manual): incorporar ilustraciones comparativas Grabar vs Manual, boton directo y regenerar Word .docx
</commit_message>
<xml_diff>
--- a/Manuales/MANUAL_USUARIO_APP.docx
+++ b/Manuales/MANUAL_USUARIO_APP.docx
@@ -28,7 +28,7 @@
         </w:p>
       </w:sdtContent>
     </w:sdt>
-    <w:bookmarkStart w:id="99" w:name="X8d71788515763cfd8ec22e06b95148859031af9"/>
+    <w:bookmarkStart w:id="38" w:name="X8d71788515763cfd8ec22e06b95148859031af9"/>
     <w:p>
       <w:pPr>
         <w:pStyle w:val="Heading1"/>
@@ -241,7 +241,7 @@
       </w:r>
     </w:p>
     <w:bookmarkEnd w:id="10"/>
-    <w:bookmarkStart w:id="17" w:name="Xe8e0e4b9ef8cb20e1e0028c8c925296c1bb6bd0"/>
+    <w:bookmarkStart w:id="11" w:name="Xe8e0e4b9ef8cb20e1e0028c8c925296c1bb6bd0"/>
     <w:p>
       <w:pPr>
         <w:pStyle w:val="Heading2"/>
@@ -310,46 +310,7 @@
         <w:pStyle w:val="FirstParagraph"/>
       </w:pPr>
       <w:r>
-        <w:drawing>
-          <wp:inline>
-            <wp:extent cx="5334000" cy="8178799"/>
-            <wp:effectExtent b="0" l="0" r="0" t="0"/>
-            <wp:docPr descr="Figura 1: Señal reglamentaria «30 CUANDO ACTIVADA» instalada en poste escolar." title="" id="12" name="Picture"/>
-            <a:graphic>
-              <a:graphicData uri="http://schemas.openxmlformats.org/drawingml/2006/picture">
-                <pic:pic>
-                  <pic:nvPicPr>
-                    <pic:cNvPr descr="img/senal_vial_hd.png" id="13" name="Picture"/>
-                    <pic:cNvPicPr>
-                      <a:picLocks noChangeArrowheads="1" noChangeAspect="1"/>
-                    </pic:cNvPicPr>
-                  </pic:nvPicPr>
-                  <pic:blipFill>
-                    <a:blip r:embed="rId11"/>
-                    <a:stretch>
-                      <a:fillRect/>
-                    </a:stretch>
-                  </pic:blipFill>
-                  <pic:spPr bwMode="auto">
-                    <a:xfrm>
-                      <a:off x="0" y="0"/>
-                      <a:ext cx="5334000" cy="8178799"/>
-                    </a:xfrm>
-                    <a:prstGeom prst="rect">
-                      <a:avLst/>
-                    </a:prstGeom>
-                    <a:noFill/>
-                    <a:ln w="9525">
-                      <a:noFill/>
-                      <a:headEnd/>
-                      <a:tailEnd/>
-                    </a:ln>
-                  </pic:spPr>
-                </pic:pic>
-              </a:graphicData>
-            </a:graphic>
-          </wp:inline>
-        </w:drawing>
+        <w:t xml:space="preserve">Figura 1: Señal reglamentaria «30 CUANDO ACTIVADA» instalada en poste escolar.</w:t>
       </w:r>
     </w:p>
     <w:p>
@@ -357,46 +318,7 @@
         <w:pStyle w:val="BodyText"/>
       </w:pPr>
       <w:r>
-        <w:drawing>
-          <wp:inline>
-            <wp:extent cx="5334000" cy="3500437"/>
-            <wp:effectExtent b="0" l="0" r="0" t="0"/>
-            <wp:docPr descr="Figura 2: Placa metálica con el horario de esa instalación. Es la fuente de verdad." title="" id="15" name="Picture"/>
-            <a:graphic>
-              <a:graphicData uri="http://schemas.openxmlformats.org/drawingml/2006/picture">
-                <pic:pic>
-                  <pic:nvPicPr>
-                    <pic:cNvPr descr="img/placa_horario_hd.png" id="16" name="Picture"/>
-                    <pic:cNvPicPr>
-                      <a:picLocks noChangeArrowheads="1" noChangeAspect="1"/>
-                    </pic:cNvPicPr>
-                  </pic:nvPicPr>
-                  <pic:blipFill>
-                    <a:blip r:embed="rId14"/>
-                    <a:stretch>
-                      <a:fillRect/>
-                    </a:stretch>
-                  </pic:blipFill>
-                  <pic:spPr bwMode="auto">
-                    <a:xfrm>
-                      <a:off x="0" y="0"/>
-                      <a:ext cx="5334000" cy="3500437"/>
-                    </a:xfrm>
-                    <a:prstGeom prst="rect">
-                      <a:avLst/>
-                    </a:prstGeom>
-                    <a:noFill/>
-                    <a:ln w="9525">
-                      <a:noFill/>
-                      <a:headEnd/>
-                      <a:tailEnd/>
-                    </a:ln>
-                  </pic:spPr>
-                </pic:pic>
-              </a:graphicData>
-            </a:graphic>
-          </wp:inline>
-        </w:drawing>
+        <w:t xml:space="preserve">Figura 2: Placa metálica con el horario de esa instalación. Es la fuente de verdad.</w:t>
       </w:r>
     </w:p>
     <w:p>
@@ -430,8 +352,8 @@
         </w:pict>
       </w:r>
     </w:p>
-    <w:bookmarkEnd w:id="17"/>
-    <w:bookmarkStart w:id="18" w:name="X8b16707d74721e88fa223dcf25d8e328d6fd3cf"/>
+    <w:bookmarkEnd w:id="11"/>
+    <w:bookmarkStart w:id="12" w:name="X8b16707d74721e88fa223dcf25d8e328d6fd3cf"/>
     <w:p>
       <w:pPr>
         <w:pStyle w:val="Heading2"/>
@@ -573,8 +495,8 @@
         </w:pict>
       </w:r>
     </w:p>
-    <w:bookmarkEnd w:id="18"/>
-    <w:bookmarkStart w:id="52" w:name="X02efc6ae22777e6ea68a8551e0a9905cca81e43"/>
+    <w:bookmarkEnd w:id="12"/>
+    <w:bookmarkStart w:id="13" w:name="X02efc6ae22777e6ea68a8551e0a9905cca81e43"/>
     <w:p>
       <w:pPr>
         <w:pStyle w:val="Heading2"/>
@@ -588,46 +510,7 @@
         <w:pStyle w:val="FirstParagraph"/>
       </w:pPr>
       <w:r>
-        <w:drawing>
-          <wp:inline>
-            <wp:extent cx="5334000" cy="8636000"/>
-            <wp:effectExtent b="0" l="0" r="0" t="0"/>
-            <wp:docPr descr="Figura 3: Selección del «Instalador de paquetes» de Android." title="" id="20" name="Picture"/>
-            <a:graphic>
-              <a:graphicData uri="http://schemas.openxmlformats.org/drawingml/2006/picture">
-                <pic:pic>
-                  <pic:nvPicPr>
-                    <pic:cNvPr descr="img/paso1_instalacion_apk.png" id="21" name="Picture"/>
-                    <pic:cNvPicPr>
-                      <a:picLocks noChangeArrowheads="1" noChangeAspect="1"/>
-                    </pic:cNvPicPr>
-                  </pic:nvPicPr>
-                  <pic:blipFill>
-                    <a:blip r:embed="rId19"/>
-                    <a:stretch>
-                      <a:fillRect/>
-                    </a:stretch>
-                  </pic:blipFill>
-                  <pic:spPr bwMode="auto">
-                    <a:xfrm>
-                      <a:off x="0" y="0"/>
-                      <a:ext cx="5334000" cy="8636000"/>
-                    </a:xfrm>
-                    <a:prstGeom prst="rect">
-                      <a:avLst/>
-                    </a:prstGeom>
-                    <a:noFill/>
-                    <a:ln w="9525">
-                      <a:noFill/>
-                      <a:headEnd/>
-                      <a:tailEnd/>
-                    </a:ln>
-                  </pic:spPr>
-                </pic:pic>
-              </a:graphicData>
-            </a:graphic>
-          </wp:inline>
-        </w:drawing>
+        <w:t xml:space="preserve">Figura 3: Selección del «Instalador de paquetes» de Android.</w:t>
       </w:r>
     </w:p>
     <w:p>
@@ -635,46 +518,7 @@
         <w:pStyle w:val="BodyText"/>
       </w:pPr>
       <w:r>
-        <w:drawing>
-          <wp:inline>
-            <wp:extent cx="5334000" cy="4318000"/>
-            <wp:effectExtent b="0" l="0" r="0" t="0"/>
-            <wp:docPr descr="Figura 4: Ventana de confirmación de instalación." title="" id="23" name="Picture"/>
-            <a:graphic>
-              <a:graphicData uri="http://schemas.openxmlformats.org/drawingml/2006/picture">
-                <pic:pic>
-                  <pic:nvPicPr>
-                    <pic:cNvPr descr="img/paso1_confirmar_instalacion.png" id="24" name="Picture"/>
-                    <pic:cNvPicPr>
-                      <a:picLocks noChangeArrowheads="1" noChangeAspect="1"/>
-                    </pic:cNvPicPr>
-                  </pic:nvPicPr>
-                  <pic:blipFill>
-                    <a:blip r:embed="rId22"/>
-                    <a:stretch>
-                      <a:fillRect/>
-                    </a:stretch>
-                  </pic:blipFill>
-                  <pic:spPr bwMode="auto">
-                    <a:xfrm>
-                      <a:off x="0" y="0"/>
-                      <a:ext cx="5334000" cy="4318000"/>
-                    </a:xfrm>
-                    <a:prstGeom prst="rect">
-                      <a:avLst/>
-                    </a:prstGeom>
-                    <a:noFill/>
-                    <a:ln w="9525">
-                      <a:noFill/>
-                      <a:headEnd/>
-                      <a:tailEnd/>
-                    </a:ln>
-                  </pic:spPr>
-                </pic:pic>
-              </a:graphicData>
-            </a:graphic>
-          </wp:inline>
-        </w:drawing>
+        <w:t xml:space="preserve">Figura 4: Ventana de confirmación de instalación.</w:t>
       </w:r>
     </w:p>
     <w:p>
@@ -682,46 +526,7 @@
         <w:pStyle w:val="BodyText"/>
       </w:pPr>
       <w:r>
-        <w:drawing>
-          <wp:inline>
-            <wp:extent cx="5334000" cy="4318000"/>
-            <wp:effectExtent b="0" l="0" r="0" t="0"/>
-            <wp:docPr descr="Figura 5: Progreso de instalación." title="" id="26" name="Picture"/>
-            <a:graphic>
-              <a:graphicData uri="http://schemas.openxmlformats.org/drawingml/2006/picture">
-                <pic:pic>
-                  <pic:nvPicPr>
-                    <pic:cNvPr descr="img/paso1_instalando_progreso.png" id="27" name="Picture"/>
-                    <pic:cNvPicPr>
-                      <a:picLocks noChangeArrowheads="1" noChangeAspect="1"/>
-                    </pic:cNvPicPr>
-                  </pic:nvPicPr>
-                  <pic:blipFill>
-                    <a:blip r:embed="rId25"/>
-                    <a:stretch>
-                      <a:fillRect/>
-                    </a:stretch>
-                  </pic:blipFill>
-                  <pic:spPr bwMode="auto">
-                    <a:xfrm>
-                      <a:off x="0" y="0"/>
-                      <a:ext cx="5334000" cy="4318000"/>
-                    </a:xfrm>
-                    <a:prstGeom prst="rect">
-                      <a:avLst/>
-                    </a:prstGeom>
-                    <a:noFill/>
-                    <a:ln w="9525">
-                      <a:noFill/>
-                      <a:headEnd/>
-                      <a:tailEnd/>
-                    </a:ln>
-                  </pic:spPr>
-                </pic:pic>
-              </a:graphicData>
-            </a:graphic>
-          </wp:inline>
-        </w:drawing>
+        <w:t xml:space="preserve">Figura 5: Progreso de instalación.</w:t>
       </w:r>
     </w:p>
     <w:p>
@@ -729,46 +534,7 @@
         <w:pStyle w:val="BodyText"/>
       </w:pPr>
       <w:r>
-        <w:drawing>
-          <wp:inline>
-            <wp:extent cx="5334000" cy="9144000"/>
-            <wp:effectExtent b="0" l="0" r="0" t="0"/>
-            <wp:docPr descr="Figura 6: Google Play Protect: hay que elegir «Instalar de todas formas»." title="" id="29" name="Picture"/>
-            <a:graphic>
-              <a:graphicData uri="http://schemas.openxmlformats.org/drawingml/2006/picture">
-                <pic:pic>
-                  <pic:nvPicPr>
-                    <pic:cNvPr descr="img/paso1_play_protect_bloqueo.png" id="30" name="Picture"/>
-                    <pic:cNvPicPr>
-                      <a:picLocks noChangeArrowheads="1" noChangeAspect="1"/>
-                    </pic:cNvPicPr>
-                  </pic:nvPicPr>
-                  <pic:blipFill>
-                    <a:blip r:embed="rId28"/>
-                    <a:stretch>
-                      <a:fillRect/>
-                    </a:stretch>
-                  </pic:blipFill>
-                  <pic:spPr bwMode="auto">
-                    <a:xfrm>
-                      <a:off x="0" y="0"/>
-                      <a:ext cx="5334000" cy="9144000"/>
-                    </a:xfrm>
-                    <a:prstGeom prst="rect">
-                      <a:avLst/>
-                    </a:prstGeom>
-                    <a:noFill/>
-                    <a:ln w="9525">
-                      <a:noFill/>
-                      <a:headEnd/>
-                      <a:tailEnd/>
-                    </a:ln>
-                  </pic:spPr>
-                </pic:pic>
-              </a:graphicData>
-            </a:graphic>
-          </wp:inline>
-        </w:drawing>
+        <w:t xml:space="preserve">Figura 6: Google Play Protect: hay que elegir «Instalar de todas formas».</w:t>
       </w:r>
     </w:p>
     <w:p>
@@ -776,46 +542,7 @@
         <w:pStyle w:val="BodyText"/>
       </w:pPr>
       <w:r>
-        <w:drawing>
-          <wp:inline>
-            <wp:extent cx="5334000" cy="4318000"/>
-            <wp:effectExtent b="0" l="0" r="0" t="0"/>
-            <wp:docPr descr="Figura 7: Instalación completada." title="" id="32" name="Picture"/>
-            <a:graphic>
-              <a:graphicData uri="http://schemas.openxmlformats.org/drawingml/2006/picture">
-                <pic:pic>
-                  <pic:nvPicPr>
-                    <pic:cNvPr descr="img/paso1_instalacion_finalizada.png" id="33" name="Picture"/>
-                    <pic:cNvPicPr>
-                      <a:picLocks noChangeArrowheads="1" noChangeAspect="1"/>
-                    </pic:cNvPicPr>
-                  </pic:nvPicPr>
-                  <pic:blipFill>
-                    <a:blip r:embed="rId31"/>
-                    <a:stretch>
-                      <a:fillRect/>
-                    </a:stretch>
-                  </pic:blipFill>
-                  <pic:spPr bwMode="auto">
-                    <a:xfrm>
-                      <a:off x="0" y="0"/>
-                      <a:ext cx="5334000" cy="4318000"/>
-                    </a:xfrm>
-                    <a:prstGeom prst="rect">
-                      <a:avLst/>
-                    </a:prstGeom>
-                    <a:noFill/>
-                    <a:ln w="9525">
-                      <a:noFill/>
-                      <a:headEnd/>
-                      <a:tailEnd/>
-                    </a:ln>
-                  </pic:spPr>
-                </pic:pic>
-              </a:graphicData>
-            </a:graphic>
-          </wp:inline>
-        </w:drawing>
+        <w:t xml:space="preserve">Figura 7: Instalación completada.</w:t>
       </w:r>
     </w:p>
     <w:p>
@@ -823,46 +550,7 @@
         <w:pStyle w:val="BodyText"/>
       </w:pPr>
       <w:r>
-        <w:drawing>
-          <wp:inline>
-            <wp:extent cx="5334000" cy="9144000"/>
-            <wp:effectExtent b="0" l="0" r="0" t="0"/>
-            <wp:docPr descr="Figura 8: Pantalla de autenticación." title="" id="35" name="Picture"/>
-            <a:graphic>
-              <a:graphicData uri="http://schemas.openxmlformats.org/drawingml/2006/picture">
-                <pic:pic>
-                  <pic:nvPicPr>
-                    <pic:cNvPr descr="img/paso3_login_app.png" id="36" name="Picture"/>
-                    <pic:cNvPicPr>
-                      <a:picLocks noChangeArrowheads="1" noChangeAspect="1"/>
-                    </pic:cNvPicPr>
-                  </pic:nvPicPr>
-                  <pic:blipFill>
-                    <a:blip r:embed="rId34"/>
-                    <a:stretch>
-                      <a:fillRect/>
-                    </a:stretch>
-                  </pic:blipFill>
-                  <pic:spPr bwMode="auto">
-                    <a:xfrm>
-                      <a:off x="0" y="0"/>
-                      <a:ext cx="5334000" cy="9144000"/>
-                    </a:xfrm>
-                    <a:prstGeom prst="rect">
-                      <a:avLst/>
-                    </a:prstGeom>
-                    <a:noFill/>
-                    <a:ln w="9525">
-                      <a:noFill/>
-                      <a:headEnd/>
-                      <a:tailEnd/>
-                    </a:ln>
-                  </pic:spPr>
-                </pic:pic>
-              </a:graphicData>
-            </a:graphic>
-          </wp:inline>
-        </w:drawing>
+        <w:t xml:space="preserve">Figura 8: Pantalla de autenticación.</w:t>
       </w:r>
     </w:p>
     <w:p>
@@ -870,46 +558,7 @@
         <w:pStyle w:val="BodyText"/>
       </w:pPr>
       <w:r>
-        <w:drawing>
-          <wp:inline>
-            <wp:extent cx="5334000" cy="9144000"/>
-            <wp:effectExtent b="0" l="0" r="0" t="0"/>
-            <wp:docPr descr="Figura 9: Permisos de dispositivos cercanos (Android 12+)." title="" id="38" name="Picture"/>
-            <a:graphic>
-              <a:graphicData uri="http://schemas.openxmlformats.org/drawingml/2006/picture">
-                <pic:pic>
-                  <pic:nvPicPr>
-                    <pic:cNvPr descr="img/paso2_permisos_dispositivos_cercanos.png" id="39" name="Picture"/>
-                    <pic:cNvPicPr>
-                      <a:picLocks noChangeArrowheads="1" noChangeAspect="1"/>
-                    </pic:cNvPicPr>
-                  </pic:nvPicPr>
-                  <pic:blipFill>
-                    <a:blip r:embed="rId37"/>
-                    <a:stretch>
-                      <a:fillRect/>
-                    </a:stretch>
-                  </pic:blipFill>
-                  <pic:spPr bwMode="auto">
-                    <a:xfrm>
-                      <a:off x="0" y="0"/>
-                      <a:ext cx="5334000" cy="9144000"/>
-                    </a:xfrm>
-                    <a:prstGeom prst="rect">
-                      <a:avLst/>
-                    </a:prstGeom>
-                    <a:noFill/>
-                    <a:ln w="9525">
-                      <a:noFill/>
-                      <a:headEnd/>
-                      <a:tailEnd/>
-                    </a:ln>
-                  </pic:spPr>
-                </pic:pic>
-              </a:graphicData>
-            </a:graphic>
-          </wp:inline>
-        </w:drawing>
+        <w:t xml:space="preserve">Figura 9: Permisos de dispositivos cercanos (Android 12+).</w:t>
       </w:r>
     </w:p>
     <w:p>
@@ -917,46 +566,7 @@
         <w:pStyle w:val="BodyText"/>
       </w:pPr>
       <w:r>
-        <w:drawing>
-          <wp:inline>
-            <wp:extent cx="5334000" cy="9144000"/>
-            <wp:effectExtent b="0" l="0" r="0" t="0"/>
-            <wp:docPr descr="Figura 10: Solicitud de habilitación del adaptador Bluetooth." title="" id="41" name="Picture"/>
-            <a:graphic>
-              <a:graphicData uri="http://schemas.openxmlformats.org/drawingml/2006/picture">
-                <pic:pic>
-                  <pic:nvPicPr>
-                    <pic:cNvPr descr="img/paso2_habilitar_bluetooth_dialog.png" id="42" name="Picture"/>
-                    <pic:cNvPicPr>
-                      <a:picLocks noChangeArrowheads="1" noChangeAspect="1"/>
-                    </pic:cNvPicPr>
-                  </pic:nvPicPr>
-                  <pic:blipFill>
-                    <a:blip r:embed="rId40"/>
-                    <a:stretch>
-                      <a:fillRect/>
-                    </a:stretch>
-                  </pic:blipFill>
-                  <pic:spPr bwMode="auto">
-                    <a:xfrm>
-                      <a:off x="0" y="0"/>
-                      <a:ext cx="5334000" cy="9144000"/>
-                    </a:xfrm>
-                    <a:prstGeom prst="rect">
-                      <a:avLst/>
-                    </a:prstGeom>
-                    <a:noFill/>
-                    <a:ln w="9525">
-                      <a:noFill/>
-                      <a:headEnd/>
-                      <a:tailEnd/>
-                    </a:ln>
-                  </pic:spPr>
-                </pic:pic>
-              </a:graphicData>
-            </a:graphic>
-          </wp:inline>
-        </w:drawing>
+        <w:t xml:space="preserve">Figura 10: Solicitud de habilitación del adaptador Bluetooth.</w:t>
       </w:r>
     </w:p>
     <w:p>
@@ -964,46 +574,7 @@
         <w:pStyle w:val="BodyText"/>
       </w:pPr>
       <w:r>
-        <w:drawing>
-          <wp:inline>
-            <wp:extent cx="5334000" cy="8636000"/>
-            <wp:effectExtent b="0" l="0" r="0" t="0"/>
-            <wp:docPr descr="Figura 11: Emparejamiento en Ajustes del teléfono y PIN (1234 / 0000)." title="" id="44" name="Picture"/>
-            <a:graphic>
-              <a:graphicData uri="http://schemas.openxmlformats.org/drawingml/2006/picture">
-                <pic:pic>
-                  <pic:nvPicPr>
-                    <pic:cNvPr descr="img/paso2_emparejamiento_bt.png" id="45" name="Picture"/>
-                    <pic:cNvPicPr>
-                      <a:picLocks noChangeArrowheads="1" noChangeAspect="1"/>
-                    </pic:cNvPicPr>
-                  </pic:nvPicPr>
-                  <pic:blipFill>
-                    <a:blip r:embed="rId43"/>
-                    <a:stretch>
-                      <a:fillRect/>
-                    </a:stretch>
-                  </pic:blipFill>
-                  <pic:spPr bwMode="auto">
-                    <a:xfrm>
-                      <a:off x="0" y="0"/>
-                      <a:ext cx="5334000" cy="8636000"/>
-                    </a:xfrm>
-                    <a:prstGeom prst="rect">
-                      <a:avLst/>
-                    </a:prstGeom>
-                    <a:noFill/>
-                    <a:ln w="9525">
-                      <a:noFill/>
-                      <a:headEnd/>
-                      <a:tailEnd/>
-                    </a:ln>
-                  </pic:spPr>
-                </pic:pic>
-              </a:graphicData>
-            </a:graphic>
-          </wp:inline>
-        </w:drawing>
+        <w:t xml:space="preserve">Figura 11: Emparejamiento en Ajustes del teléfono y PIN (1234 / 0000).</w:t>
       </w:r>
     </w:p>
     <w:p>
@@ -1011,46 +582,7 @@
         <w:pStyle w:val="BodyText"/>
       </w:pPr>
       <w:r>
-        <w:drawing>
-          <wp:inline>
-            <wp:extent cx="5334000" cy="6604000"/>
-            <wp:effectExtent b="0" l="0" r="0" t="0"/>
-            <wp:docPr descr="Figura 12: Selección del módulo desde la aplicación." title="" id="47" name="Picture"/>
-            <a:graphic>
-              <a:graphicData uri="http://schemas.openxmlformats.org/drawingml/2006/picture">
-                <pic:pic>
-                  <pic:nvPicPr>
-                    <pic:cNvPr descr="img/paso4_dialog_dispositivos.png" id="48" name="Picture"/>
-                    <pic:cNvPicPr>
-                      <a:picLocks noChangeArrowheads="1" noChangeAspect="1"/>
-                    </pic:cNvPicPr>
-                  </pic:nvPicPr>
-                  <pic:blipFill>
-                    <a:blip r:embed="rId46"/>
-                    <a:stretch>
-                      <a:fillRect/>
-                    </a:stretch>
-                  </pic:blipFill>
-                  <pic:spPr bwMode="auto">
-                    <a:xfrm>
-                      <a:off x="0" y="0"/>
-                      <a:ext cx="5334000" cy="6604000"/>
-                    </a:xfrm>
-                    <a:prstGeom prst="rect">
-                      <a:avLst/>
-                    </a:prstGeom>
-                    <a:noFill/>
-                    <a:ln w="9525">
-                      <a:noFill/>
-                      <a:headEnd/>
-                      <a:tailEnd/>
-                    </a:ln>
-                  </pic:spPr>
-                </pic:pic>
-              </a:graphicData>
-            </a:graphic>
-          </wp:inline>
-        </w:drawing>
+        <w:t xml:space="preserve">Figura 12: Selección del módulo desde la aplicación.</w:t>
       </w:r>
     </w:p>
     <w:p>
@@ -1058,46 +590,7 @@
         <w:pStyle w:val="BodyText"/>
       </w:pPr>
       <w:r>
-        <w:drawing>
-          <wp:inline>
-            <wp:extent cx="5334000" cy="11176000"/>
-            <wp:effectExtent b="0" l="0" r="0" t="0"/>
-            <wp:docPr descr="Figura 13: Pantalla principal de control y diagnóstico." title="" id="50" name="Picture"/>
-            <a:graphic>
-              <a:graphicData uri="http://schemas.openxmlformats.org/drawingml/2006/picture">
-                <pic:pic>
-                  <pic:nvPicPr>
-                    <pic:cNvPr descr="img/paso4_pantalla_principal.png" id="51" name="Picture"/>
-                    <pic:cNvPicPr>
-                      <a:picLocks noChangeArrowheads="1" noChangeAspect="1"/>
-                    </pic:cNvPicPr>
-                  </pic:nvPicPr>
-                  <pic:blipFill>
-                    <a:blip r:embed="rId49"/>
-                    <a:stretch>
-                      <a:fillRect/>
-                    </a:stretch>
-                  </pic:blipFill>
-                  <pic:spPr bwMode="auto">
-                    <a:xfrm>
-                      <a:off x="0" y="0"/>
-                      <a:ext cx="5334000" cy="11176000"/>
-                    </a:xfrm>
-                    <a:prstGeom prst="rect">
-                      <a:avLst/>
-                    </a:prstGeom>
-                    <a:noFill/>
-                    <a:ln w="9525">
-                      <a:noFill/>
-                      <a:headEnd/>
-                      <a:tailEnd/>
-                    </a:ln>
-                  </pic:spPr>
-                </pic:pic>
-              </a:graphicData>
-            </a:graphic>
-          </wp:inline>
-        </w:drawing>
+        <w:t xml:space="preserve">Figura 13: Pantalla principal de control y diagnóstico.</w:t>
       </w:r>
     </w:p>
     <w:p>
@@ -1132,7 +625,7 @@
           <w:b/>
           <w:bCs/>
         </w:rPr>
-        <w:t xml:space="preserve">DISPOSITIVO</w:t>
+        <w:t xml:space="preserve">CONECTAR</w:t>
       </w:r>
       <w:r>
         <w:t xml:space="preserve">.</w:t>
@@ -1184,8 +677,8 @@
         </w:pict>
       </w:r>
     </w:p>
-    <w:bookmarkEnd w:id="52"/>
-    <w:bookmarkStart w:id="59" w:name="X8b5ef35122bd8813d77ae79c97c9c64923880f7"/>
+    <w:bookmarkEnd w:id="13"/>
+    <w:bookmarkStart w:id="17" w:name="X8b5ef35122bd8813d77ae79c97c9c64923880f7"/>
     <w:p>
       <w:pPr>
         <w:pStyle w:val="Heading2"/>
@@ -1198,11 +691,11 @@
       <w:pPr>
         <w:pStyle w:val="Heading3"/>
       </w:pPr>
-      <w:bookmarkStart w:id="53" w:name="Xed9a9945977c3a70a90a8fbd8be50e72bc1d7ed"/>
+      <w:bookmarkStart w:id="14" w:name="Xed9a9945977c3a70a90a8fbd8be50e72bc1d7ed"/>
       <w:r>
         <w:t xml:space="preserve">El horario lo manda la placa, no la aplicación</w:t>
       </w:r>
-      <w:bookmarkEnd w:id="53"/>
+      <w:bookmarkEnd w:id="14"/>
     </w:p>
     <w:p>
       <w:pPr>
@@ -1298,7 +791,7 @@
         <w:t xml:space="preserve">: la aplicación confirmará igualmente que grabó.</w:t>
       </w:r>
     </w:p>
-    <w:bookmarkStart w:id="57" w:name="X780e89c4feaa43df4d2dd0a4b8e5fab770c1a77"/>
+    <w:bookmarkStart w:id="15" w:name="X780e89c4feaa43df4d2dd0a4b8e5fab770c1a77"/>
     <w:p>
       <w:pPr>
         <w:pStyle w:val="Heading3"/>
@@ -1312,46 +805,7 @@
         <w:pStyle w:val="FirstParagraph"/>
       </w:pPr>
       <w:r>
-        <w:drawing>
-          <wp:inline>
-            <wp:extent cx="5334000" cy="5461000"/>
-            <wp:effectExtent b="0" l="0" r="0" t="0"/>
-            <wp:docPr descr="Figura 14: Tarjeta «HORARIO DE ESTA PLACA», con sus cuatro franjas." title="" id="55" name="Picture"/>
-            <a:graphic>
-              <a:graphicData uri="http://schemas.openxmlformats.org/drawingml/2006/picture">
-                <pic:pic>
-                  <pic:nvPicPr>
-                    <pic:cNvPr descr="img/paso6_detalle_horario_escolar.png" id="56" name="Picture"/>
-                    <pic:cNvPicPr>
-                      <a:picLocks noChangeArrowheads="1" noChangeAspect="1"/>
-                    </pic:cNvPicPr>
-                  </pic:nvPicPr>
-                  <pic:blipFill>
-                    <a:blip r:embed="rId54"/>
-                    <a:stretch>
-                      <a:fillRect/>
-                    </a:stretch>
-                  </pic:blipFill>
-                  <pic:spPr bwMode="auto">
-                    <a:xfrm>
-                      <a:off x="0" y="0"/>
-                      <a:ext cx="5334000" cy="5461000"/>
-                    </a:xfrm>
-                    <a:prstGeom prst="rect">
-                      <a:avLst/>
-                    </a:prstGeom>
-                    <a:noFill/>
-                    <a:ln w="9525">
-                      <a:noFill/>
-                      <a:headEnd/>
-                      <a:tailEnd/>
-                    </a:ln>
-                  </pic:spPr>
-                </pic:pic>
-              </a:graphicData>
-            </a:graphic>
-          </wp:inline>
-        </w:drawing>
+        <w:t xml:space="preserve">Figura 14: Tarjeta «HORARIO DE ESTA PLACA», con sus cuatro franjas.</w:t>
       </w:r>
     </w:p>
     <w:p>
@@ -1422,7 +876,34 @@
         <w:t xml:space="preserve"> </w:t>
       </w:r>
       <w:r>
-        <w:t xml:space="preserve">y el derecho el final.</w:t>
+        <w:t xml:space="preserve">y el derecho el final (mostrados con formato nítido</w:t>
+      </w:r>
+      <w:r>
+        <w:t xml:space="preserve"> </w:t>
+      </w:r>
+      <w:r>
+        <w:rPr>
+          <w:rStyle w:val="VerbatimChar"/>
+        </w:rPr>
+        <w:t xml:space="preserve">06:00</w:t>
+      </w:r>
+      <w:r>
+        <w:t xml:space="preserve"> </w:t>
+      </w:r>
+      <w:r>
+        <w:t xml:space="preserve">a</w:t>
+      </w:r>
+      <w:r>
+        <w:t xml:space="preserve"> </w:t>
+      </w:r>
+      <w:r>
+        <w:rPr>
+          <w:rStyle w:val="VerbatimChar"/>
+        </w:rPr>
+        <w:t xml:space="preserve">09:00</w:t>
+      </w:r>
+      <w:r>
+        <w:t xml:space="preserve">).</w:t>
       </w:r>
     </w:p>
     <w:p>
@@ -1537,17 +1018,17 @@
         </w:numPr>
       </w:pPr>
       <w:r>
-        <w:t xml:space="preserve">Al aceptar, la aplicación sincroniza el reloj del equipo con la hora del teléfono, graba las</w:t>
-      </w:r>
-      <w:r>
-        <w:t xml:space="preserve"> </w:t>
-      </w:r>
-      <w:r>
-        <w:t xml:space="preserve">franjas y vuelve a leer la baliza para que usted vea cómo quedó.</w:t>
-      </w:r>
-    </w:p>
-    <w:bookmarkEnd w:id="57"/>
-    <w:bookmarkStart w:id="58" w:name="X484c4fc71a1a590a59ef049da5ee4e202412eab"/>
+        <w:t xml:space="preserve">Al aceptar, la aplicación sincroniza el reloj del equipo con la hora del teléfono, graba en lote las</w:t>
+      </w:r>
+      <w:r>
+        <w:t xml:space="preserve"> </w:t>
+      </w:r>
+      <w:r>
+        <w:t xml:space="preserve">franjas (con retardo seguro de 450 ms) y vuelve a leer la baliza para que usted vea cómo quedó.</w:t>
+      </w:r>
+    </w:p>
+    <w:bookmarkEnd w:id="15"/>
+    <w:bookmarkStart w:id="16" w:name="X484c4fc71a1a590a59ef049da5ee4e202412eab"/>
     <w:p>
       <w:pPr>
         <w:pStyle w:val="Heading3"/>
@@ -1610,9 +1091,9 @@
         </w:pict>
       </w:r>
     </w:p>
-    <w:bookmarkEnd w:id="58"/>
-    <w:bookmarkEnd w:id="59"/>
-    <w:bookmarkStart w:id="63" w:name="X4b22da503533cba86dce70edf53d82e520be978"/>
+    <w:bookmarkEnd w:id="16"/>
+    <w:bookmarkEnd w:id="17"/>
+    <w:bookmarkStart w:id="18" w:name="X4b22da503533cba86dce70edf53d82e520be978"/>
     <w:p>
       <w:pPr>
         <w:pStyle w:val="Heading2"/>
@@ -1758,7 +1239,7 @@
               <w:pStyle w:val="Compact"/>
             </w:pPr>
             <w:r>
-              <w:t xml:space="preserve">Vuelve a grabar el horario que esté en pantalla.</w:t>
+              <w:t xml:space="preserve">Vuelve a grabar el horario de la placa que esté en pantalla.</w:t>
             </w:r>
           </w:p>
         </w:tc>
@@ -1769,46 +1250,7 @@
         <w:pStyle w:val="BodyText"/>
       </w:pPr>
       <w:r>
-        <w:drawing>
-          <wp:inline>
-            <wp:extent cx="5334000" cy="2667000"/>
-            <wp:effectExtent b="0" l="0" r="0" t="0"/>
-            <wp:docPr descr="Figura 15: Botones de receso escolar." title="" id="61" name="Picture"/>
-            <a:graphic>
-              <a:graphicData uri="http://schemas.openxmlformats.org/drawingml/2006/picture">
-                <pic:pic>
-                  <pic:nvPicPr>
-                    <pic:cNvPr descr="img/paso6_detalle_receso_escolar.png" id="62" name="Picture"/>
-                    <pic:cNvPicPr>
-                      <a:picLocks noChangeArrowheads="1" noChangeAspect="1"/>
-                    </pic:cNvPicPr>
-                  </pic:nvPicPr>
-                  <pic:blipFill>
-                    <a:blip r:embed="rId60"/>
-                    <a:stretch>
-                      <a:fillRect/>
-                    </a:stretch>
-                  </pic:blipFill>
-                  <pic:spPr bwMode="auto">
-                    <a:xfrm>
-                      <a:off x="0" y="0"/>
-                      <a:ext cx="5334000" cy="2667000"/>
-                    </a:xfrm>
-                    <a:prstGeom prst="rect">
-                      <a:avLst/>
-                    </a:prstGeom>
-                    <a:noFill/>
-                    <a:ln w="9525">
-                      <a:noFill/>
-                      <a:headEnd/>
-                      <a:tailEnd/>
-                    </a:ln>
-                  </pic:spPr>
-                </pic:pic>
-              </a:graphicData>
-            </a:graphic>
-          </wp:inline>
-        </w:drawing>
+        <w:t xml:space="preserve">Figura 15: Botones de receso escolar.</w:t>
       </w:r>
     </w:p>
     <w:p>
@@ -1853,14 +1295,14 @@
         </w:pict>
       </w:r>
     </w:p>
-    <w:bookmarkEnd w:id="63"/>
-    <w:bookmarkStart w:id="64" w:name="Xd5047d1f1044f3e60f018e496464747fdd2a98b"/>
+    <w:bookmarkEnd w:id="18"/>
+    <w:bookmarkStart w:id="20" w:name="X18e3b957c825951568eecf30ec7203e710a8e2e"/>
     <w:p>
       <w:pPr>
         <w:pStyle w:val="Heading2"/>
       </w:pPr>
       <w:r>
-        <w:t xml:space="preserve">5. Asignación de Nombre / Ubicación por el Aire (OTA)</w:t>
+        <w:t xml:space="preserve">4ter. ¿«Grabar Horario de Placa» vs «Programación Manual de Franja»?</w:t>
       </w:r>
     </w:p>
     <w:p>
@@ -1868,19 +1310,368 @@
         <w:pStyle w:val="FirstParagraph"/>
       </w:pPr>
       <w:r>
-        <w:t xml:space="preserve">Para identificar cada baliza en un corredor vial con múltiples señales:</w:t>
-      </w:r>
-    </w:p>
-    <w:p>
-      <w:pPr>
-        <w:pStyle w:val="Compact"/>
-        <w:numPr>
-          <w:ilvl w:val="0"/>
-          <w:numId w:val="1006"/>
-        </w:numPr>
-      </w:pPr>
-      <w:r>
-        <w:t xml:space="preserve">En la tarjeta</w:t>
+        <w:t xml:space="preserve">Una duda común entre técnicos es la diferencia entre estos dos métodos:</w:t>
+      </w:r>
+    </w:p>
+    <w:p>
+      <w:pPr>
+        <w:pStyle w:val="BodyText"/>
+      </w:pPr>
+      <w:r>
+        <w:t xml:space="preserve">Figura 16: Comparativa gráfica de flujos: Grabar Horario de Placa vs Programación Manual.</w:t>
+      </w:r>
+    </w:p>
+    <w:tbl>
+      <w:tblPr>
+        <w:tblStyle w:val="Table"/>
+        <w:tblW w:type="auto" w:w="0"/>
+        <w:tblLook w:firstRow="1" w:lastRow="0" w:firstColumn="0" w:lastColumn="0" w:noHBand="0" w:noVBand="0" w:val="0020"/>
+      </w:tblPr>
+      <w:tblGrid>
+        <w:gridCol w:w="2640"/>
+        <w:gridCol w:w="2640"/>
+        <w:gridCol w:w="2640"/>
+      </w:tblGrid>
+      <w:tr>
+        <w:trPr>
+          <w:tblHeader w:val="on"/>
+        </w:trPr>
+        <w:tc>
+          <w:tcPr/>
+          <w:p>
+            <w:pPr>
+              <w:pStyle w:val="Compact"/>
+              <w:jc w:val="left"/>
+            </w:pPr>
+            <w:r>
+              <w:t xml:space="preserve">Característica</w:t>
+            </w:r>
+          </w:p>
+        </w:tc>
+        <w:tc>
+          <w:tcPr/>
+          <w:p>
+            <w:pPr>
+              <w:pStyle w:val="Compact"/>
+              <w:jc w:val="left"/>
+            </w:pPr>
+            <w:r>
+              <w:t xml:space="preserve">⚡ GRABAR HORARIO DE ESTA PLACA (Lote)</w:t>
+            </w:r>
+          </w:p>
+        </w:tc>
+        <w:tc>
+          <w:tcPr/>
+          <w:p>
+            <w:pPr>
+              <w:pStyle w:val="Compact"/>
+              <w:jc w:val="left"/>
+            </w:pPr>
+            <w:r>
+              <w:t xml:space="preserve">⚙️ PROGRAMACIÓN MANUAL (Quirúrgico)</w:t>
+            </w:r>
+          </w:p>
+        </w:tc>
+      </w:tr>
+      <w:tr>
+        <w:tc>
+          <w:tcPr/>
+          <w:p>
+            <w:pPr>
+              <w:pStyle w:val="Compact"/>
+              <w:jc w:val="left"/>
+            </w:pPr>
+            <w:r>
+              <w:rPr>
+                <w:b/>
+                <w:bCs/>
+              </w:rPr>
+              <w:t xml:space="preserve">Propósito</w:t>
+            </w:r>
+          </w:p>
+        </w:tc>
+        <w:tc>
+          <w:tcPr/>
+          <w:p>
+            <w:pPr>
+              <w:pStyle w:val="Compact"/>
+              <w:jc w:val="left"/>
+            </w:pPr>
+            <w:r>
+              <w:t xml:space="preserve">Configuración</w:t>
+            </w:r>
+            <w:r>
+              <w:t xml:space="preserve"> </w:t>
+            </w:r>
+            <w:r>
+              <w:rPr>
+                <w:b/>
+                <w:bCs/>
+              </w:rPr>
+              <w:t xml:space="preserve">integral</w:t>
+            </w:r>
+            <w:r>
+              <w:t xml:space="preserve"> </w:t>
+            </w:r>
+            <w:r>
+              <w:t xml:space="preserve">de la señal al llegar al colegio.</w:t>
+            </w:r>
+          </w:p>
+        </w:tc>
+        <w:tc>
+          <w:tcPr/>
+          <w:p>
+            <w:pPr>
+              <w:pStyle w:val="Compact"/>
+              <w:jc w:val="left"/>
+            </w:pPr>
+            <w:r>
+              <w:t xml:space="preserve">Ajuste técnico puntual de</w:t>
+            </w:r>
+            <w:r>
+              <w:t xml:space="preserve"> </w:t>
+            </w:r>
+            <w:r>
+              <w:rPr>
+                <w:b/>
+                <w:bCs/>
+              </w:rPr>
+              <w:t xml:space="preserve">UNA sola alarma</w:t>
+            </w:r>
+            <w:r>
+              <w:t xml:space="preserve">.</w:t>
+            </w:r>
+          </w:p>
+        </w:tc>
+      </w:tr>
+      <w:tr>
+        <w:tc>
+          <w:tcPr/>
+          <w:p>
+            <w:pPr>
+              <w:pStyle w:val="Compact"/>
+              <w:jc w:val="left"/>
+            </w:pPr>
+            <w:r>
+              <w:rPr>
+                <w:b/>
+                <w:bCs/>
+              </w:rPr>
+              <w:t xml:space="preserve">Reloj RTC</w:t>
+            </w:r>
+          </w:p>
+        </w:tc>
+        <w:tc>
+          <w:tcPr/>
+          <w:p>
+            <w:pPr>
+              <w:pStyle w:val="Compact"/>
+              <w:jc w:val="left"/>
+            </w:pPr>
+            <w:r>
+              <w:rPr>
+                <w:b/>
+                <w:bCs/>
+              </w:rPr>
+              <w:t xml:space="preserve">Sincroniza automáticamente</w:t>
+            </w:r>
+            <w:r>
+              <w:t xml:space="preserve"> </w:t>
+            </w:r>
+            <w:r>
+              <w:t xml:space="preserve">la fecha/hora con el teléfono móvil.</w:t>
+            </w:r>
+          </w:p>
+        </w:tc>
+        <w:tc>
+          <w:tcPr/>
+          <w:p>
+            <w:pPr>
+              <w:pStyle w:val="Compact"/>
+              <w:jc w:val="left"/>
+            </w:pPr>
+            <w:r>
+              <w:rPr>
+                <w:b/>
+                <w:bCs/>
+              </w:rPr>
+              <w:t xml:space="preserve">No altera</w:t>
+            </w:r>
+            <w:r>
+              <w:t xml:space="preserve"> </w:t>
+            </w:r>
+            <w:r>
+              <w:t xml:space="preserve">la hora actual del reloj.</w:t>
+            </w:r>
+          </w:p>
+        </w:tc>
+      </w:tr>
+      <w:tr>
+        <w:tc>
+          <w:tcPr/>
+          <w:p>
+            <w:pPr>
+              <w:pStyle w:val="Compact"/>
+              <w:jc w:val="left"/>
+            </w:pPr>
+            <w:r>
+              <w:rPr>
+                <w:b/>
+                <w:bCs/>
+              </w:rPr>
+              <w:t xml:space="preserve">Memoria</w:t>
+            </w:r>
+          </w:p>
+        </w:tc>
+        <w:tc>
+          <w:tcPr/>
+          <w:p>
+            <w:pPr>
+              <w:pStyle w:val="Compact"/>
+              <w:jc w:val="left"/>
+            </w:pPr>
+            <w:r>
+              <w:t xml:space="preserve">Reescribe de forma secuencial las 4 franjas (apaga las que estén en OFF).</w:t>
+            </w:r>
+          </w:p>
+        </w:tc>
+        <w:tc>
+          <w:tcPr/>
+          <w:p>
+            <w:pPr>
+              <w:pStyle w:val="Compact"/>
+              <w:jc w:val="left"/>
+            </w:pPr>
+            <w:r>
+              <w:t xml:space="preserve">Modifica únicamente la alarma seleccionada (1 a 5); las demás quedan intactas.</w:t>
+            </w:r>
+          </w:p>
+        </w:tc>
+      </w:tr>
+      <w:tr>
+        <w:tc>
+          <w:tcPr/>
+          <w:p>
+            <w:pPr>
+              <w:pStyle w:val="Compact"/>
+              <w:jc w:val="left"/>
+            </w:pPr>
+            <w:r>
+              <w:rPr>
+                <w:b/>
+                <w:bCs/>
+              </w:rPr>
+              <w:t xml:space="preserve">¿Guardar es Enviar?</w:t>
+            </w:r>
+          </w:p>
+        </w:tc>
+        <w:tc>
+          <w:tcPr/>
+          <w:p>
+            <w:pPr>
+              <w:pStyle w:val="Compact"/>
+              <w:jc w:val="left"/>
+            </w:pPr>
+            <w:r>
+              <w:rPr>
+                <w:b/>
+                <w:bCs/>
+              </w:rPr>
+              <w:t xml:space="preserve">Sí:</w:t>
+            </w:r>
+            <w:r>
+              <w:t xml:space="preserve"> </w:t>
+            </w:r>
+            <w:r>
+              <w:t xml:space="preserve">Al confirmar, se envía la secuencia por Bluetooth y se graba en EEPROM.</w:t>
+            </w:r>
+          </w:p>
+        </w:tc>
+        <w:tc>
+          <w:tcPr/>
+          <w:p>
+            <w:pPr>
+              <w:pStyle w:val="Compact"/>
+              <w:jc w:val="left"/>
+            </w:pPr>
+            <w:r>
+              <w:rPr>
+                <w:b/>
+                <w:bCs/>
+              </w:rPr>
+              <w:t xml:space="preserve">Sí:</w:t>
+            </w:r>
+            <w:r>
+              <w:t xml:space="preserve"> </w:t>
+            </w:r>
+            <w:r>
+              <w:t xml:space="preserve">Al pulsar el botón verde</w:t>
+            </w:r>
+            <w:r>
+              <w:t xml:space="preserve"> </w:t>
+            </w:r>
+            <w:r>
+              <w:rPr>
+                <w:rStyle w:val="VerbatimChar"/>
+                <w:b/>
+                <w:bCs/>
+              </w:rPr>
+              <w:t xml:space="preserve">⚡ ENVIAR Y GRABAR ESTA FRANJA</w:t>
+            </w:r>
+            <w:r>
+              <w:t xml:space="preserve">, se despacha la trama UART y se graba inmediatamente en la EEPROM física del PIC.</w:t>
+            </w:r>
+          </w:p>
+        </w:tc>
+      </w:tr>
+    </w:tbl>
+    <w:bookmarkStart w:id="19" w:name="botón-directo-de-programación-manual"/>
+    <w:p>
+      <w:pPr>
+        <w:pStyle w:val="Heading3"/>
+      </w:pPr>
+      <w:r>
+        <w:t xml:space="preserve">Botón Directo de Programación Manual</w:t>
+      </w:r>
+    </w:p>
+    <w:p>
+      <w:pPr>
+        <w:pStyle w:val="FirstParagraph"/>
+      </w:pPr>
+      <w:r>
+        <w:t xml:space="preserve">Para mayor comodidad del técnico, la tarjeta</w:t>
+      </w:r>
+      <w:r>
+        <w:t xml:space="preserve"> </w:t>
+      </w:r>
+      <w:r>
+        <w:rPr>
+          <w:b/>
+          <w:bCs/>
+        </w:rPr>
+        <w:t xml:space="preserve">6. PROGRAMACIÓN MANUAL DE FRANJA</w:t>
+      </w:r>
+      <w:r>
+        <w:t xml:space="preserve"> </w:t>
+      </w:r>
+      <w:r>
+        <w:t xml:space="preserve">incluye su propio botón verde directo:</w:t>
+      </w:r>
+    </w:p>
+    <w:p>
+      <w:pPr>
+        <w:pStyle w:val="BodyText"/>
+      </w:pPr>
+      <w:r>
+        <w:t xml:space="preserve">Figura 17: Tarjeta de Programación Manual con su botón verde directo «ENVIAR Y GRABAR ESTA FRANJA».</w:t>
+      </w:r>
+    </w:p>
+    <w:p>
+      <w:pPr>
+        <w:pStyle w:val="BodyText"/>
+      </w:pPr>
+      <w:r>
+        <w:t xml:space="preserve">No es necesario hacer scroll hacia arriba: al pulsar este botón, la trama de la alarma seleccionada (ej.</w:t>
       </w:r>
       <w:r>
         <w:t xml:space="preserve"> </w:t>
@@ -1888,72 +1679,11 @@
       <w:r>
         <w:rPr>
           <w:rStyle w:val="VerbatimChar"/>
-          <w:b/>
-          <w:bCs/>
-        </w:rPr>
-        <w:t xml:space="preserve">NOMBRE / UBICACIÓN DE LA SEÑAL</w:t>
-      </w:r>
-      <w:r>
-        <w:t xml:space="preserve">, escriba el nombre o punto kilométrico (ej.</w:t>
-      </w:r>
-      <w:r>
-        <w:t xml:space="preserve"> </w:t>
-      </w:r>
-      <w:r>
-        <w:rPr>
-          <w:rStyle w:val="VerbatimChar"/>
-        </w:rPr>
-        <w:t xml:space="preserve">Col. San José - Km 4+200</w:t>
-      </w:r>
-      <w:r>
-        <w:t xml:space="preserve">).</w:t>
-      </w:r>
-    </w:p>
-    <w:p>
-      <w:pPr>
-        <w:pStyle w:val="Compact"/>
-        <w:numPr>
-          <w:ilvl w:val="0"/>
-          <w:numId w:val="1006"/>
-        </w:numPr>
-      </w:pPr>
-      <w:r>
-        <w:t xml:space="preserve">Presione</w:t>
-      </w:r>
-      <w:r>
-        <w:t xml:space="preserve"> </w:t>
-      </w:r>
-      <w:r>
-        <w:rPr>
-          <w:rStyle w:val="VerbatimChar"/>
-          <w:b/>
-          <w:bCs/>
-        </w:rPr>
-        <w:t xml:space="preserve">GUARDAR</w:t>
-      </w:r>
-      <w:r>
-        <w:t xml:space="preserve">.</w:t>
-      </w:r>
-    </w:p>
-    <w:p>
-      <w:pPr>
-        <w:pStyle w:val="Compact"/>
-        <w:numPr>
-          <w:ilvl w:val="0"/>
-          <w:numId w:val="1006"/>
-        </w:numPr>
-      </w:pPr>
-      <w:r>
-        <w:t xml:space="preserve">El nombre se graba de forma permanente en la memoria EEPROM física de la baliza (</w:t>
-      </w:r>
-      <w:r>
-        <w:rPr>
-          <w:rStyle w:val="VerbatimChar"/>
-        </w:rPr>
-        <w:t xml:space="preserve">0x40..0x5F</w:t>
-      </w:r>
-      <w:r>
-        <w:t xml:space="preserve">) y en su teléfono.</w:t>
+        </w:rPr>
+        <w:t xml:space="preserve">¿A3,E1,I1430,F1630,D9,?</w:t>
+      </w:r>
+      <w:r>
+        <w:t xml:space="preserve">) viaja al microcontrolador y queda almacenada de forma permanente.</w:t>
       </w:r>
     </w:p>
     <w:p>
@@ -1963,14 +1693,15 @@
         </w:pict>
       </w:r>
     </w:p>
-    <w:bookmarkEnd w:id="64"/>
-    <w:bookmarkStart w:id="71" w:name="Xb1455442e58cd6f0308bdf616fbc15e55422308"/>
+    <w:bookmarkEnd w:id="19"/>
+    <w:bookmarkEnd w:id="20"/>
+    <w:bookmarkStart w:id="21" w:name="Xd5047d1f1044f3e60f018e496464747fdd2a98b"/>
     <w:p>
       <w:pPr>
         <w:pStyle w:val="Heading2"/>
       </w:pPr>
       <w:r>
-        <w:t xml:space="preserve">6. Motor de Autodiagnóstico y Dictamen en Campo</w:t>
+        <w:t xml:space="preserve">5. Asignación de Nombre / Ubicación por el Aire (OTA)</w:t>
       </w:r>
     </w:p>
     <w:p>
@@ -1978,101 +1709,19 @@
         <w:pStyle w:val="FirstParagraph"/>
       </w:pPr>
       <w:r>
-        <w:drawing>
-          <wp:inline>
-            <wp:extent cx="5334000" cy="8636000"/>
-            <wp:effectExtent b="0" l="0" r="0" t="0"/>
-            <wp:docPr descr="Figura 16: Configuración manual de franja horaria." title="" id="66" name="Picture"/>
-            <a:graphic>
-              <a:graphicData uri="http://schemas.openxmlformats.org/drawingml/2006/picture">
-                <pic:pic>
-                  <pic:nvPicPr>
-                    <pic:cNvPr descr="img/paso7_config_franja_detalle.png" id="67" name="Picture"/>
-                    <pic:cNvPicPr>
-                      <a:picLocks noChangeArrowheads="1" noChangeAspect="1"/>
-                    </pic:cNvPicPr>
-                  </pic:nvPicPr>
-                  <pic:blipFill>
-                    <a:blip r:embed="rId65"/>
-                    <a:stretch>
-                      <a:fillRect/>
-                    </a:stretch>
-                  </pic:blipFill>
-                  <pic:spPr bwMode="auto">
-                    <a:xfrm>
-                      <a:off x="0" y="0"/>
-                      <a:ext cx="5334000" cy="8636000"/>
-                    </a:xfrm>
-                    <a:prstGeom prst="rect">
-                      <a:avLst/>
-                    </a:prstGeom>
-                    <a:noFill/>
-                    <a:ln w="9525">
-                      <a:noFill/>
-                      <a:headEnd/>
-                      <a:tailEnd/>
-                    </a:ln>
-                  </pic:spPr>
-                </pic:pic>
-              </a:graphicData>
-            </a:graphic>
-          </wp:inline>
-        </w:drawing>
-      </w:r>
-    </w:p>
-    <w:p>
-      <w:pPr>
-        <w:pStyle w:val="BodyText"/>
-      </w:pPr>
-      <w:r>
-        <w:drawing>
-          <wp:inline>
-            <wp:extent cx="5334000" cy="8636000"/>
-            <wp:effectExtent b="0" l="0" r="0" t="0"/>
-            <wp:docPr descr="Figura 17: Menús desplegables de alarma, horas, minutos y días." title="" id="69" name="Picture"/>
-            <a:graphic>
-              <a:graphicData uri="http://schemas.openxmlformats.org/drawingml/2006/picture">
-                <pic:pic>
-                  <pic:nvPicPr>
-                    <pic:cNvPr descr="img/paso7_dropdowns_combinados.png" id="70" name="Picture"/>
-                    <pic:cNvPicPr>
-                      <a:picLocks noChangeArrowheads="1" noChangeAspect="1"/>
-                    </pic:cNvPicPr>
-                  </pic:nvPicPr>
-                  <pic:blipFill>
-                    <a:blip r:embed="rId68"/>
-                    <a:stretch>
-                      <a:fillRect/>
-                    </a:stretch>
-                  </pic:blipFill>
-                  <pic:spPr bwMode="auto">
-                    <a:xfrm>
-                      <a:off x="0" y="0"/>
-                      <a:ext cx="5334000" cy="8636000"/>
-                    </a:xfrm>
-                    <a:prstGeom prst="rect">
-                      <a:avLst/>
-                    </a:prstGeom>
-                    <a:noFill/>
-                    <a:ln w="9525">
-                      <a:noFill/>
-                      <a:headEnd/>
-                      <a:tailEnd/>
-                    </a:ln>
-                  </pic:spPr>
-                </pic:pic>
-              </a:graphicData>
-            </a:graphic>
-          </wp:inline>
-        </w:drawing>
-      </w:r>
-    </w:p>
-    <w:p>
-      <w:pPr>
-        <w:pStyle w:val="BodyText"/>
-      </w:pPr>
-      <w:r>
-        <w:t xml:space="preserve">Al presionar</w:t>
+        <w:t xml:space="preserve">Para identificar cada baliza en un corredor vial con múltiples señales:</w:t>
+      </w:r>
+    </w:p>
+    <w:p>
+      <w:pPr>
+        <w:pStyle w:val="Compact"/>
+        <w:numPr>
+          <w:ilvl w:val="0"/>
+          <w:numId w:val="1006"/>
+        </w:numPr>
+      </w:pPr>
+      <w:r>
+        <w:t xml:space="preserve">En la tarjeta</w:t>
       </w:r>
       <w:r>
         <w:t xml:space="preserve"> </w:t>
@@ -2083,48 +1732,69 @@
           <w:b/>
           <w:bCs/>
         </w:rPr>
-        <w:t xml:space="preserve">LEER</w:t>
-      </w:r>
-      <w:r>
-        <w:t xml:space="preserve">, la App ejecuta un análisis instantáneo y muestra el semáforo de dictamen técnico:</w:t>
-      </w:r>
-    </w:p>
-    <w:p>
-      <w:pPr>
-        <w:pStyle w:val="SourceCode"/>
-      </w:pPr>
+        <w:t xml:space="preserve">NOMBRE / UBICACIÓN DE LA SEÑAL</w:t>
+      </w:r>
+      <w:r>
+        <w:t xml:space="preserve">, escriba el nombre o punto kilométrico (ej.</w:t>
+      </w:r>
+      <w:r>
+        <w:t xml:space="preserve"> </w:t>
+      </w:r>
       <w:r>
         <w:rPr>
           <w:rStyle w:val="VerbatimChar"/>
         </w:rPr>
-        <w:t xml:space="preserve">flowchart LR</w:t>
-      </w:r>
-      <w:r>
-        <w:br/>
+        <w:t xml:space="preserve">Col. San José - Km 4+200</w:t>
+      </w:r>
+      <w:r>
+        <w:t xml:space="preserve">).</w:t>
+      </w:r>
+    </w:p>
+    <w:p>
+      <w:pPr>
+        <w:pStyle w:val="Compact"/>
+        <w:numPr>
+          <w:ilvl w:val="0"/>
+          <w:numId w:val="1006"/>
+        </w:numPr>
+      </w:pPr>
+      <w:r>
+        <w:t xml:space="preserve">Presione</w:t>
+      </w:r>
+      <w:r>
+        <w:t xml:space="preserve"> </w:t>
       </w:r>
       <w:r>
         <w:rPr>
           <w:rStyle w:val="VerbatimChar"/>
-        </w:rPr>
-        <w:t xml:space="preserve">    A["🟢 100% OPERATIVO"] --&gt; B["Batería &gt;12.4V, reloj sincronizado y memoria íntegra."]</w:t>
-      </w:r>
-      <w:r>
-        <w:br/>
+          <w:b/>
+          <w:bCs/>
+        </w:rPr>
+        <w:t xml:space="preserve">GUARDAR</w:t>
+      </w:r>
+      <w:r>
+        <w:t xml:space="preserve">.</w:t>
+      </w:r>
+    </w:p>
+    <w:p>
+      <w:pPr>
+        <w:pStyle w:val="Compact"/>
+        <w:numPr>
+          <w:ilvl w:val="0"/>
+          <w:numId w:val="1006"/>
+        </w:numPr>
+      </w:pPr>
+      <w:r>
+        <w:t xml:space="preserve">El nombre se graba de forma permanente en la memoria EEPROM física de la baliza (</w:t>
       </w:r>
       <w:r>
         <w:rPr>
           <w:rStyle w:val="VerbatimChar"/>
         </w:rPr>
-        <w:t xml:space="preserve">    C["🟡 PILA CR2032 AGOTADA"] --&gt; D["Tarjeta sana. Cambiar pila de botón de 3V en gabinete."]</w:t>
-      </w:r>
-      <w:r>
-        <w:br/>
-      </w:r>
-      <w:r>
-        <w:rPr>
-          <w:rStyle w:val="VerbatimChar"/>
-        </w:rPr>
-        <w:t xml:space="preserve">    E["🔴 BATERÍA 12V BAJA"] --&gt; F["Tarjeta sana. Limpiar panel solar o revisar fusible."]</w:t>
+        <w:t xml:space="preserve">0x40..0x5F</w:t>
+      </w:r>
+      <w:r>
+        <w:t xml:space="preserve">) y en su teléfono.</w:t>
       </w:r>
     </w:p>
     <w:p>
@@ -2134,14 +1804,14 @@
         </w:pict>
       </w:r>
     </w:p>
-    <w:bookmarkEnd w:id="71"/>
-    <w:bookmarkStart w:id="75" w:name="X5dbdf40e7c001d99398b171486a28389fa75aa8"/>
+    <w:bookmarkEnd w:id="21"/>
+    <w:bookmarkStart w:id="22" w:name="Xb1455442e58cd6f0308bdf616fbc15e55422308"/>
     <w:p>
       <w:pPr>
         <w:pStyle w:val="Heading2"/>
       </w:pPr>
       <w:r>
-        <w:t xml:space="preserve">7. Prueba Física de Foco (Mando Directo)</w:t>
+        <w:t xml:space="preserve">6. Motor de Autodiagnóstico y Dictamen en Campo</w:t>
       </w:r>
     </w:p>
     <w:p>
@@ -2149,68 +1819,15 @@
         <w:pStyle w:val="FirstParagraph"/>
       </w:pPr>
       <w:r>
-        <w:drawing>
-          <wp:inline>
-            <wp:extent cx="5334000" cy="2667000"/>
-            <wp:effectExtent b="0" l="0" r="0" t="0"/>
-            <wp:docPr descr="Figura 18: Tarjeta de diagnóstico y prueba de luz." title="" id="73" name="Picture"/>
-            <a:graphic>
-              <a:graphicData uri="http://schemas.openxmlformats.org/drawingml/2006/picture">
-                <pic:pic>
-                  <pic:nvPicPr>
-                    <pic:cNvPr descr="img/paso8_detalle_diagnostico_luz.png" id="74" name="Picture"/>
-                    <pic:cNvPicPr>
-                      <a:picLocks noChangeArrowheads="1" noChangeAspect="1"/>
-                    </pic:cNvPicPr>
-                  </pic:nvPicPr>
-                  <pic:blipFill>
-                    <a:blip r:embed="rId72"/>
-                    <a:stretch>
-                      <a:fillRect/>
-                    </a:stretch>
-                  </pic:blipFill>
-                  <pic:spPr bwMode="auto">
-                    <a:xfrm>
-                      <a:off x="0" y="0"/>
-                      <a:ext cx="5334000" cy="2667000"/>
-                    </a:xfrm>
-                    <a:prstGeom prst="rect">
-                      <a:avLst/>
-                    </a:prstGeom>
-                    <a:noFill/>
-                    <a:ln w="9525">
-                      <a:noFill/>
-                      <a:headEnd/>
-                      <a:tailEnd/>
-                    </a:ln>
-                  </pic:spPr>
-                </pic:pic>
-              </a:graphicData>
-            </a:graphic>
-          </wp:inline>
-        </w:drawing>
-      </w:r>
-    </w:p>
-    <w:p>
-      <w:pPr>
-        <w:pStyle w:val="Compact"/>
-        <w:numPr>
-          <w:ilvl w:val="0"/>
-          <w:numId w:val="1007"/>
-        </w:numPr>
-      </w:pPr>
-      <w:r>
-        <w:rPr>
-          <w:b/>
-          <w:bCs/>
-        </w:rPr>
-        <w:t xml:space="preserve">Activar Test (2 min):</w:t>
-      </w:r>
-      <w:r>
-        <w:t xml:space="preserve"> </w:t>
-      </w:r>
-      <w:r>
-        <w:t xml:space="preserve">Presione</w:t>
+        <w:t xml:space="preserve">Figura 18: Menús desplegables de alarma, horas, minutos y días.</w:t>
+      </w:r>
+    </w:p>
+    <w:p>
+      <w:pPr>
+        <w:pStyle w:val="BodyText"/>
+      </w:pPr>
+      <w:r>
+        <w:t xml:space="preserve">Al presionar</w:t>
       </w:r>
       <w:r>
         <w:t xml:space="preserve"> </w:t>
@@ -2218,51 +1835,51 @@
       <w:r>
         <w:rPr>
           <w:rStyle w:val="VerbatimChar"/>
-        </w:rPr>
-        <w:t xml:space="preserve">💡 Activar Test (2 min)</w:t>
-      </w:r>
-      <w:r>
-        <w:t xml:space="preserve"> </w:t>
-      </w:r>
-      <w:r>
-        <w:t xml:space="preserve">para encender el destello ámbar a 1.0 Hz y verificar los LEDs y el circuito de potencia.</w:t>
-      </w:r>
-    </w:p>
-    <w:p>
-      <w:pPr>
-        <w:pStyle w:val="Compact"/>
-        <w:numPr>
-          <w:ilvl w:val="0"/>
-          <w:numId w:val="1007"/>
-        </w:numPr>
-      </w:pPr>
-      <w:r>
-        <w:rPr>
-          <w:b/>
-          <w:bCs/>
-        </w:rPr>
-        <w:t xml:space="preserve">Apagar Test:</w:t>
-      </w:r>
-      <w:r>
-        <w:t xml:space="preserve"> </w:t>
-      </w:r>
-      <w:r>
-        <w:t xml:space="preserve">Presione</w:t>
-      </w:r>
-      <w:r>
-        <w:t xml:space="preserve"> </w:t>
-      </w:r>
+          <w:b/>
+          <w:bCs/>
+        </w:rPr>
+        <w:t xml:space="preserve">LEER</w:t>
+      </w:r>
+      <w:r>
+        <w:t xml:space="preserve">, la App ejecuta un análisis instantáneo y muestra el semáforo de dictamen técnico:</w:t>
+      </w:r>
+    </w:p>
+    <w:p>
+      <w:pPr>
+        <w:pStyle w:val="SourceCode"/>
+      </w:pPr>
       <w:r>
         <w:rPr>
           <w:rStyle w:val="VerbatimChar"/>
         </w:rPr>
-        <w:t xml:space="preserve">⏹️ Apagar Test</w:t>
-      </w:r>
-      <w:r>
-        <w:t xml:space="preserve"> </w:t>
-      </w:r>
-      <w:r>
-        <w:t xml:space="preserve">para detener el destello inmediatamente.</w:t>
+        <w:t xml:space="preserve">flowchart LR</w:t>
+      </w:r>
+      <w:r>
+        <w:br/>
+      </w:r>
+      <w:r>
+        <w:rPr>
+          <w:rStyle w:val="VerbatimChar"/>
+        </w:rPr>
+        <w:t xml:space="preserve">    A["🟢 100% OPERATIVO"] --&gt; B["Batería &gt;12.4V, reloj sincronizado y memoria íntegra."]</w:t>
+      </w:r>
+      <w:r>
+        <w:br/>
+      </w:r>
+      <w:r>
+        <w:rPr>
+          <w:rStyle w:val="VerbatimChar"/>
+        </w:rPr>
+        <w:t xml:space="preserve">    C["🟡 PILA CR2032 AGOTADA"] --&gt; D["Tarjeta sana. Cambiar pila de botón de 3V en gabinete."]</w:t>
+      </w:r>
+      <w:r>
+        <w:br/>
+      </w:r>
+      <w:r>
+        <w:rPr>
+          <w:rStyle w:val="VerbatimChar"/>
+        </w:rPr>
+        <w:t xml:space="preserve">    E["🔴 BATERÍA 12V BAJA"] --&gt; F["Tarjeta sana. Limpiar panel solar o revisar fusible."]</w:t>
       </w:r>
     </w:p>
     <w:p>
@@ -2272,17 +1889,116 @@
         </w:pict>
       </w:r>
     </w:p>
-    <w:bookmarkEnd w:id="75"/>
-    <w:bookmarkStart w:id="87" w:name="Xc82fa43529897bd5fa34ce228a2c44ae3e6ff8d"/>
+    <w:bookmarkEnd w:id="22"/>
+    <w:bookmarkStart w:id="23" w:name="X5dbdf40e7c001d99398b171486a28389fa75aa8"/>
     <w:p>
       <w:pPr>
         <w:pStyle w:val="Heading2"/>
       </w:pPr>
       <w:r>
+        <w:t xml:space="preserve">7. Prueba Física de Foco (Mando Directo)</w:t>
+      </w:r>
+    </w:p>
+    <w:p>
+      <w:pPr>
+        <w:pStyle w:val="FirstParagraph"/>
+      </w:pPr>
+      <w:r>
+        <w:t xml:space="preserve">Figura 18: Tarjeta de diagnóstico y prueba de luz.</w:t>
+      </w:r>
+    </w:p>
+    <w:p>
+      <w:pPr>
+        <w:pStyle w:val="Compact"/>
+        <w:numPr>
+          <w:ilvl w:val="0"/>
+          <w:numId w:val="1007"/>
+        </w:numPr>
+      </w:pPr>
+      <w:r>
+        <w:rPr>
+          <w:b/>
+          <w:bCs/>
+        </w:rPr>
+        <w:t xml:space="preserve">Activar Test (2 min):</w:t>
+      </w:r>
+      <w:r>
+        <w:t xml:space="preserve"> </w:t>
+      </w:r>
+      <w:r>
+        <w:t xml:space="preserve">Presione</w:t>
+      </w:r>
+      <w:r>
+        <w:t xml:space="preserve"> </w:t>
+      </w:r>
+      <w:r>
+        <w:rPr>
+          <w:rStyle w:val="VerbatimChar"/>
+        </w:rPr>
+        <w:t xml:space="preserve">💡 Activar Test (2 min)</w:t>
+      </w:r>
+      <w:r>
+        <w:t xml:space="preserve"> </w:t>
+      </w:r>
+      <w:r>
+        <w:t xml:space="preserve">para encender el destello ámbar a 1.0 Hz y verificar los LEDs y el circuito de potencia.</w:t>
+      </w:r>
+    </w:p>
+    <w:p>
+      <w:pPr>
+        <w:pStyle w:val="Compact"/>
+        <w:numPr>
+          <w:ilvl w:val="0"/>
+          <w:numId w:val="1007"/>
+        </w:numPr>
+      </w:pPr>
+      <w:r>
+        <w:rPr>
+          <w:b/>
+          <w:bCs/>
+        </w:rPr>
+        <w:t xml:space="preserve">Apagar Test:</w:t>
+      </w:r>
+      <w:r>
+        <w:t xml:space="preserve"> </w:t>
+      </w:r>
+      <w:r>
+        <w:t xml:space="preserve">Presione</w:t>
+      </w:r>
+      <w:r>
+        <w:t xml:space="preserve"> </w:t>
+      </w:r>
+      <w:r>
+        <w:rPr>
+          <w:rStyle w:val="VerbatimChar"/>
+        </w:rPr>
+        <w:t xml:space="preserve">⏹️ Apagar Test</w:t>
+      </w:r>
+      <w:r>
+        <w:t xml:space="preserve"> </w:t>
+      </w:r>
+      <w:r>
+        <w:t xml:space="preserve">para detener el destello inmediatamente.</w:t>
+      </w:r>
+    </w:p>
+    <w:p>
+      <w:r>
+        <w:pict>
+          <v:rect style="width:0;height:1.5pt" o:hralign="center" o:hrstd="t" o:hr="t"/>
+        </w:pict>
+      </w:r>
+    </w:p>
+    <w:bookmarkEnd w:id="23"/>
+    <w:bookmarkStart w:id="29" w:name="Xc82fa43529897bd5fa34ce228a2c44ae3e6ff8d"/>
+    <w:p>
+      <w:pPr>
+        <w:pStyle w:val="Heading2"/>
+      </w:pPr>
+      <w:r>
         <w:t xml:space="preserve">8. Mantenimiento, Inspección y Acta</w:t>
       </w:r>
     </w:p>
-    <w:bookmarkStart w:id="76" w:name="X3ea513830886557fbe0480ac4ffeccc16f9552d"/>
+    <w:bookmarkStart w:id="24" w:name="X3ea513830886557fbe0480ac4ffeccc16f9552d"/>
     <w:p>
       <w:pPr>
         <w:pStyle w:val="Heading3"/>
@@ -2371,8 +2087,8 @@
         <w:t xml:space="preserve">(apartado 5), que sí se graba en la memoria del equipo y viaja con el poste.</w:t>
       </w:r>
     </w:p>
-    <w:bookmarkEnd w:id="76"/>
-    <w:bookmarkStart w:id="84" w:name="X1b56ee94196f72fbf20ad5f25996f39ce625eee"/>
+    <w:bookmarkEnd w:id="24"/>
+    <w:bookmarkStart w:id="26" w:name="X1b56ee94196f72fbf20ad5f25996f39ce625eee"/>
     <w:p>
       <w:pPr>
         <w:pStyle w:val="Heading3"/>
@@ -2501,46 +2217,7 @@
         <w:pStyle w:val="BodyText"/>
       </w:pPr>
       <w:r>
-        <w:drawing>
-          <wp:inline>
-            <wp:extent cx="5334000" cy="6934200"/>
-            <wp:effectExtent b="0" l="0" r="0" t="0"/>
-            <wp:docPr descr="Figura 20: Inspección a nivel de suelo. Solo aparecen los nueve puntos que se pueden comprobar sin subir, y el aviso enumera lo que queda pendiente." title="" id="78" name="Picture"/>
-            <a:graphic>
-              <a:graphicData uri="http://schemas.openxmlformats.org/drawingml/2006/picture">
-                <pic:pic>
-                  <pic:nvPicPr>
-                    <pic:cNvPr descr="img/paso9_mantenimiento_suelo.png" id="79" name="Picture"/>
-                    <pic:cNvPicPr>
-                      <a:picLocks noChangeArrowheads="1" noChangeAspect="1"/>
-                    </pic:cNvPicPr>
-                  </pic:nvPicPr>
-                  <pic:blipFill>
-                    <a:blip r:embed="rId77"/>
-                    <a:stretch>
-                      <a:fillRect/>
-                    </a:stretch>
-                  </pic:blipFill>
-                  <pic:spPr bwMode="auto">
-                    <a:xfrm>
-                      <a:off x="0" y="0"/>
-                      <a:ext cx="5334000" cy="6934200"/>
-                    </a:xfrm>
-                    <a:prstGeom prst="rect">
-                      <a:avLst/>
-                    </a:prstGeom>
-                    <a:noFill/>
-                    <a:ln w="9525">
-                      <a:noFill/>
-                      <a:headEnd/>
-                      <a:tailEnd/>
-                    </a:ln>
-                  </pic:spPr>
-                </pic:pic>
-              </a:graphicData>
-            </a:graphic>
-          </wp:inline>
-        </w:drawing>
+        <w:t xml:space="preserve">Figura 20: Inspección a nivel de suelo. Solo aparecen los nueve puntos que se pueden comprobar sin subir, y el aviso enumera lo que queda pendiente.</w:t>
       </w:r>
     </w:p>
     <w:p>
@@ -2548,57 +2225,18 @@
         <w:pStyle w:val="BodyText"/>
       </w:pPr>
       <w:r>
-        <w:drawing>
-          <wp:inline>
-            <wp:extent cx="5334000" cy="9021417"/>
-            <wp:effectExtent b="0" l="0" r="0" t="0"/>
-            <wp:docPr descr="Figura 21: Inspección en altura. Aparecen además los siete puntos que exigen subir al poste." title="" id="81" name="Picture"/>
-            <a:graphic>
-              <a:graphicData uri="http://schemas.openxmlformats.org/drawingml/2006/picture">
-                <pic:pic>
-                  <pic:nvPicPr>
-                    <pic:cNvPr descr="img/paso9_mantenimiento_altura.png" id="82" name="Picture"/>
-                    <pic:cNvPicPr>
-                      <a:picLocks noChangeArrowheads="1" noChangeAspect="1"/>
-                    </pic:cNvPicPr>
-                  </pic:nvPicPr>
-                  <pic:blipFill>
-                    <a:blip r:embed="rId80"/>
-                    <a:stretch>
-                      <a:fillRect/>
-                    </a:stretch>
-                  </pic:blipFill>
-                  <pic:spPr bwMode="auto">
-                    <a:xfrm>
-                      <a:off x="0" y="0"/>
-                      <a:ext cx="5334000" cy="9021417"/>
-                    </a:xfrm>
-                    <a:prstGeom prst="rect">
-                      <a:avLst/>
-                    </a:prstGeom>
-                    <a:noFill/>
-                    <a:ln w="9525">
-                      <a:noFill/>
-                      <a:headEnd/>
-                      <a:tailEnd/>
-                    </a:ln>
-                  </pic:spPr>
-                </pic:pic>
-              </a:graphicData>
-            </a:graphic>
-          </wp:inline>
-        </w:drawing>
+        <w:t xml:space="preserve">Figura 21: Inspección en altura. Aparecen además los siete puntos que exigen subir al poste.</w:t>
       </w:r>
     </w:p>
     <w:p>
       <w:pPr>
         <w:pStyle w:val="Heading3"/>
       </w:pPr>
-      <w:bookmarkStart w:id="83" w:name="Xd5b017bcfccd37df5fa5d44be24c4f576f5745a"/>
+      <w:bookmarkStart w:id="25" w:name="Xd5b017bcfccd37df5fa5d44be24c4f576f5745a"/>
       <w:r>
         <w:t xml:space="preserve">Por qué los puntos de altura no aparecen desde el suelo</w:t>
       </w:r>
-      <w:bookmarkEnd w:id="83"/>
+      <w:bookmarkEnd w:id="25"/>
     </w:p>
     <w:p>
       <w:pPr>
@@ -2679,8 +2317,8 @@
         <w:t xml:space="preserve">Es intencionado: esa visita ya no los verificó.</w:t>
       </w:r>
     </w:p>
-    <w:bookmarkEnd w:id="84"/>
-    <w:bookmarkStart w:id="85" w:name="X010271a9b53e6adf591ad4cd5909a758c4af628"/>
+    <w:bookmarkEnd w:id="26"/>
+    <w:bookmarkStart w:id="27" w:name="X010271a9b53e6adf591ad4cd5909a758c4af628"/>
     <w:p>
       <w:pPr>
         <w:pStyle w:val="Heading3"/>
@@ -2976,8 +2614,8 @@
         <w:t xml:space="preserve">la mira un conductor.</w:t>
       </w:r>
     </w:p>
-    <w:bookmarkEnd w:id="85"/>
-    <w:bookmarkStart w:id="86" w:name="Xa5ed3f3919df5b4d7c468e8e2c1c46fa4f57345"/>
+    <w:bookmarkEnd w:id="27"/>
+    <w:bookmarkStart w:id="28" w:name="Xa5ed3f3919df5b4d7c468e8e2c1c46fa4f57345"/>
     <w:p>
       <w:pPr>
         <w:pStyle w:val="Heading3"/>
@@ -3223,9 +2861,9 @@
         </w:pict>
       </w:r>
     </w:p>
-    <w:bookmarkEnd w:id="86"/>
-    <w:bookmarkEnd w:id="87"/>
-    <w:bookmarkStart w:id="88" w:name="X06bc916911ab243a6474ce90c45df1014598c7a"/>
+    <w:bookmarkEnd w:id="28"/>
+    <w:bookmarkEnd w:id="29"/>
+    <w:bookmarkStart w:id="30" w:name="X06bc916911ab243a6474ce90c45df1014598c7a"/>
     <w:p>
       <w:pPr>
         <w:pStyle w:val="Heading2"/>
@@ -3306,8 +2944,8 @@
         </w:pict>
       </w:r>
     </w:p>
-    <w:bookmarkEnd w:id="88"/>
-    <w:bookmarkStart w:id="98" w:name="X1859056b7a6bd7cc5185d4df29b89fdfe6d7b4f"/>
+    <w:bookmarkEnd w:id="30"/>
+    <w:bookmarkStart w:id="37" w:name="X1859056b7a6bd7cc5185d4df29b89fdfe6d7b4f"/>
     <w:p>
       <w:pPr>
         <w:pStyle w:val="Heading2"/>
@@ -3321,46 +2959,7 @@
         <w:pStyle w:val="FirstParagraph"/>
       </w:pPr>
       <w:r>
-        <w:drawing>
-          <wp:inline>
-            <wp:extent cx="5334000" cy="3556000"/>
-            <wp:effectExtent b="0" l="0" r="0" t="0"/>
-            <wp:docPr descr="Figura 19: Canales oficiales de soporte técnico IT VIAL S.A.S." title="" id="90" name="Picture"/>
-            <a:graphic>
-              <a:graphicData uri="http://schemas.openxmlformats.org/drawingml/2006/picture">
-                <pic:pic>
-                  <pic:nvPicPr>
-                    <pic:cNvPr descr="img/portada_it_vial_creditos.png" id="91" name="Picture"/>
-                    <pic:cNvPicPr>
-                      <a:picLocks noChangeArrowheads="1" noChangeAspect="1"/>
-                    </pic:cNvPicPr>
-                  </pic:nvPicPr>
-                  <pic:blipFill>
-                    <a:blip r:embed="rId89"/>
-                    <a:stretch>
-                      <a:fillRect/>
-                    </a:stretch>
-                  </pic:blipFill>
-                  <pic:spPr bwMode="auto">
-                    <a:xfrm>
-                      <a:off x="0" y="0"/>
-                      <a:ext cx="5334000" cy="3556000"/>
-                    </a:xfrm>
-                    <a:prstGeom prst="rect">
-                      <a:avLst/>
-                    </a:prstGeom>
-                    <a:noFill/>
-                    <a:ln w="9525">
-                      <a:noFill/>
-                      <a:headEnd/>
-                      <a:tailEnd/>
-                    </a:ln>
-                  </pic:spPr>
-                </pic:pic>
-              </a:graphicData>
-            </a:graphic>
-          </wp:inline>
-        </w:drawing>
+        <w:t xml:space="preserve">Figura 19: Canales oficiales de soporte técnico IT VIAL S.A.S.</w:t>
       </w:r>
     </w:p>
     <w:p>
@@ -3377,7 +2976,7 @@
       <w:r>
         <w:t xml:space="preserve"> </w:t>
       </w:r>
-      <w:hyperlink r:id="rId92">
+      <w:hyperlink r:id="rId31">
         <w:r>
           <w:rPr>
             <w:rStyle w:val="Hyperlink"/>
@@ -3400,7 +2999,7 @@
       <w:r>
         <w:t xml:space="preserve"> </w:t>
       </w:r>
-      <w:hyperlink r:id="rId93">
+      <w:hyperlink r:id="rId32">
         <w:r>
           <w:rPr>
             <w:rStyle w:val="Hyperlink"/>
@@ -3423,7 +3022,7 @@
       <w:r>
         <w:t xml:space="preserve"> </w:t>
       </w:r>
-      <w:hyperlink r:id="rId94">
+      <w:hyperlink r:id="rId33">
         <w:r>
           <w:rPr>
             <w:rStyle w:val="Hyperlink"/>
@@ -3446,7 +3045,7 @@
       <w:r>
         <w:t xml:space="preserve"> </w:t>
       </w:r>
-      <w:hyperlink r:id="rId95">
+      <w:hyperlink r:id="rId34">
         <w:r>
           <w:rPr>
             <w:rStyle w:val="Hyperlink"/>
@@ -3469,7 +3068,7 @@
       <w:r>
         <w:t xml:space="preserve"> </w:t>
       </w:r>
-      <w:hyperlink r:id="rId96">
+      <w:hyperlink r:id="rId35">
         <w:r>
           <w:rPr>
             <w:rStyle w:val="Hyperlink"/>
@@ -3492,7 +3091,7 @@
       <w:r>
         <w:t xml:space="preserve"> </w:t>
       </w:r>
-      <w:hyperlink r:id="rId97">
+      <w:hyperlink r:id="rId36">
         <w:r>
           <w:rPr>
             <w:rStyle w:val="Hyperlink"/>
@@ -3501,8 +3100,8 @@
         </w:r>
       </w:hyperlink>
     </w:p>
-    <w:bookmarkEnd w:id="98"/>
-    <w:bookmarkEnd w:id="99"/>
+    <w:bookmarkEnd w:id="37"/>
+    <w:bookmarkEnd w:id="38"/>
     <w:sectPr>
       <w:footnotePr>
         <w:numRestart w:val="eachSect"/>

</xml_diff>